<commit_message>
Clean all probate templates: remove sample client data, use placeholders
- doc06: Remove hard-coded fund account numbers, Hakmilik Strata details,
  Public Bank names; replace with {{BANK1_NAME}}, {{OTHER1_DESC}} etc.
- doc02/doc03/doc08: Replace hard-coded 2025 with {{FILING_YEAR}}
- form14a: Remove TAN CHENG SWEE name, replace with {{DECEASED_NAME}}
- Keep Muar as firm practice location (per user request)

Co-Authored-By: Claude Opus 4.6 <noreply@anthropic.com>
</commit_message>
<xml_diff>
--- a/probate_templates/doc02_afidavit_probet.docx
+++ b/probate_templates/doc02_afidavit_probet.docx
@@ -6190,7 +6190,7 @@
           <w:szCs w:val="22"/>
           <w:u w:val="single"/>
         </w:rPr>
-        <w:t>SAMAN PEMULA NO. {{CASE_NUMBER}}                                2025</w:t>
+        <w:t>SAMAN PEMULA NO. {{CASE_NUMBER}}                                {{FILING_YEAR}}</w:t>
       </w:r>
     </w:p>
     <w:p>
@@ -7334,7 +7334,7 @@
           <w:szCs w:val="22"/>
           <w:u w:val="single"/>
         </w:rPr>
-        <w:t>SAMAN PEMULA NO. {{CASE_NUMBER}}                                2025</w:t>
+        <w:t>SAMAN PEMULA NO. {{CASE_NUMBER}}                                {{FILING_YEAR}}</w:t>
       </w:r>
     </w:p>
     <w:p>
@@ -8461,7 +8461,7 @@
           <w:szCs w:val="22"/>
           <w:u w:val="single"/>
         </w:rPr>
-        <w:t>SAMAN PEMULA NO. {{CASE_NUMBER}}                                2025</w:t>
+        <w:t>SAMAN PEMULA NO. {{CASE_NUMBER}}                                {{FILING_YEAR}}</w:t>
       </w:r>
     </w:p>
     <w:p>

</xml_diff>

<commit_message>
Keep court-standard font size, split long header lines instead
Split NAME+NRIC+PEMOHON into two lines in doc02 exhibit pages
(same format as all other document headers). Removed font size
reduction approach - courts require standard 11pt minimum.

Co-Authored-By: Claude Opus 4.6 <noreply@anthropic.com>
</commit_message>
<xml_diff>
--- a/probate_templates/doc02_afidavit_probet.docx
+++ b/probate_templates/doc02_afidavit_probet.docx
@@ -6752,9 +6752,7 @@
           <w:sz w:val="22"/>
           <w:szCs w:val="22"/>
         </w:rPr>
-        <w:t>{{APPLICANT_NAME}} (No. K/P: {{APPLICANT_NRIC}})</w:t>
-        <w:tab/>
-        <w:t>…PEMOHON</w:t>
+        <w:t>{{APPLICANT_NAME}}</w:t>
       </w:r>
       <w:proofErr w:type="spellStart"/>
       <w:r>
@@ -6838,6 +6836,28 @@
           <w:sz w:val="22"/>
           <w:szCs w:val="22"/>
         </w:rPr>
+      </w:r>
+    </w:p>
+    <w:p>
+      <w:pPr>
+        <w:rPr>
+          <w:rFonts w:ascii="Arial" w:hAnsi="Arial" w:cs="Arial"/>
+          <w:b/>
+          <w:sz w:val="22"/>
+          <w:szCs w:val="22"/>
+        </w:rPr>
+      </w:pPr>
+      <w:proofErr w:type="spellStart"/>
+      <w:proofErr w:type="spellEnd"/>
+      <w:r>
+        <w:rPr>
+          <w:rFonts w:ascii="Arial" w:hAnsi="Arial" w:cs="Arial"/>
+          <w:b/>
+          <w:bCs/>
+          <w:sz w:val="22"/>
+          <w:szCs w:val="22"/>
+        </w:rPr>
+        <w:t>(No. K/P: {{APPLICANT_NRIC}})	…PEMOHON</w:t>
       </w:r>
     </w:p>
     <w:p>

</xml_diff>

<commit_message>
Fix JURAT signing page: put name on separate right-aligned line below Pada
The applicant name after "Pada )" was overrunning to next line for long
names. Now the name appears on its own right-aligned line below the
signature dots, matching court form convention.

Co-Authored-By: Claude Opus 4.6 <noreply@anthropic.com>
</commit_message>
<xml_diff>
--- a/probate_templates/doc02_afidavit_probet.docx
+++ b/probate_templates/doc02_afidavit_probet.docx
@@ -5259,60 +5259,83 @@
         <w:t>Pada</w:t>
         <w:tab/>
         <w:t>)</w:t>
-        <w:tab/>
+      </w:r>
+      <w:proofErr w:type="gramStart"/>
+      <w:r>
+        <w:rPr>
+          <w:rFonts w:ascii="Arial" w:hAnsi="Arial" w:cs="Arial"/>
+          <w:b/>
+          <w:sz w:val="22"/>
+          <w:szCs w:val="22"/>
+        </w:rPr>
+      </w:r>
+      <w:r>
+        <w:rPr>
+          <w:rFonts w:ascii="Arial" w:hAnsi="Arial" w:cs="Arial"/>
+          <w:sz w:val="22"/>
+          <w:szCs w:val="22"/>
+        </w:rPr>
+      </w:r>
+      <w:r>
+        <w:rPr>
+          <w:rFonts w:ascii="Arial" w:hAnsi="Arial" w:cs="Arial"/>
+          <w:sz w:val="22"/>
+          <w:szCs w:val="22"/>
+        </w:rPr>
+      </w:r>
+      <w:proofErr w:type="gramEnd"/>
+      <w:r>
+        <w:rPr>
+          <w:rFonts w:ascii="Arial" w:hAnsi="Arial" w:cs="Arial"/>
+          <w:sz w:val="22"/>
+          <w:szCs w:val="22"/>
+        </w:rPr>
+      </w:r>
+      <w:r>
+        <w:rPr>
+          <w:rFonts w:ascii="Arial" w:hAnsi="Arial" w:cs="Arial"/>
+          <w:b/>
+          <w:bCs/>
+          <w:sz w:val="22"/>
+          <w:szCs w:val="22"/>
+        </w:rPr>
+      </w:r>
+      <w:proofErr w:type="spellStart"/>
+      <w:r>
+        <w:rPr>
+          <w:rFonts w:ascii="Arial" w:hAnsi="Arial" w:cs="Arial"/>
+          <w:b/>
+          <w:bCs/>
+          <w:sz w:val="22"/>
+          <w:szCs w:val="22"/>
+        </w:rPr>
+      </w:r>
+      <w:proofErr w:type="spellEnd"/>
+    </w:p>
+    <w:p>
+      <w:pPr>
+        <w:tabs>
+          <w:tab w:val="left" w:pos="4320"/>
+        </w:tabs>
+        <w:rPr>
+          <w:rFonts w:ascii="Arial" w:hAnsi="Arial" w:cs="Arial"/>
+          <w:sz w:val="22"/>
+          <w:szCs w:val="22"/>
+        </w:rPr>
+        <w:jc w:val="right"/>
+      </w:pPr>
+      <w:proofErr w:type="gramStart"/>
+      <w:proofErr w:type="gramEnd"/>
+      <w:proofErr w:type="spellStart"/>
+      <w:proofErr w:type="spellEnd"/>
+      <w:r>
+        <w:rPr>
+          <w:rFonts w:ascii="Arial" w:hAnsi="Arial" w:cs="Arial"/>
+          <w:sz w:val="22"/>
+          <w:szCs w:val="22"/>
+        </w:rPr>
         <w:t>{{APPLICANT_NAME}}</w:t>
       </w:r>
-      <w:proofErr w:type="gramStart"/>
-      <w:r>
-        <w:rPr>
-          <w:rFonts w:ascii="Arial" w:hAnsi="Arial" w:cs="Arial"/>
-          <w:b/>
-          <w:sz w:val="22"/>
-          <w:szCs w:val="22"/>
-        </w:rPr>
-      </w:r>
-      <w:r>
-        <w:rPr>
-          <w:rFonts w:ascii="Arial" w:hAnsi="Arial" w:cs="Arial"/>
-          <w:sz w:val="22"/>
-          <w:szCs w:val="22"/>
-        </w:rPr>
-      </w:r>
-      <w:r>
-        <w:rPr>
-          <w:rFonts w:ascii="Arial" w:hAnsi="Arial" w:cs="Arial"/>
-          <w:sz w:val="22"/>
-          <w:szCs w:val="22"/>
-        </w:rPr>
-      </w:r>
-      <w:proofErr w:type="gramEnd"/>
-      <w:r>
-        <w:rPr>
-          <w:rFonts w:ascii="Arial" w:hAnsi="Arial" w:cs="Arial"/>
-          <w:sz w:val="22"/>
-          <w:szCs w:val="22"/>
-        </w:rPr>
-      </w:r>
-      <w:r>
-        <w:rPr>
-          <w:rFonts w:ascii="Arial" w:hAnsi="Arial" w:cs="Arial"/>
-          <w:b/>
-          <w:bCs/>
-          <w:sz w:val="22"/>
-          <w:szCs w:val="22"/>
-        </w:rPr>
-      </w:r>
-      <w:proofErr w:type="spellStart"/>
-      <w:r>
-        <w:rPr>
-          <w:rFonts w:ascii="Arial" w:hAnsi="Arial" w:cs="Arial"/>
-          <w:b/>
-          <w:bCs/>
-          <w:sz w:val="22"/>
-          <w:szCs w:val="22"/>
-        </w:rPr>
-      </w:r>
-      <w:proofErr w:type="spellEnd"/>
     </w:p>
     <w:p>
       <w:pPr>

</xml_diff>

<commit_message>
Clean up JURAT spacing: proper tab alignment, fill lines for Di/Pada
- Di line: clean fill line + tab + signature dots
- Pada line: clean fill line + tab bracket
- NRIC bracket: removed trailing spaces
- Name on separate right-aligned line under signature dots

Co-Authored-By: Claude Opus 4.6 <noreply@anthropic.com>
</commit_message>
<xml_diff>
--- a/probate_templates/doc02_afidavit_probet.docx
+++ b/probate_templates/doc02_afidavit_probet.docx
@@ -5123,7 +5123,7 @@
         </w:rPr>
         <w:t>(No. K/P: {{APPLICANT_NRIC}})</w:t>
         <w:tab/>
-        <w:t xml:space="preserve">)         </w:t>
+        <w:t>)</w:t>
       </w:r>
       <w:r>
         <w:rPr>
@@ -5184,41 +5184,40 @@
           <w:sz w:val="22"/>
           <w:szCs w:val="22"/>
         </w:rPr>
-        <w:t>Di</w:t>
-      </w:r>
-      <w:r>
-        <w:rPr>
-          <w:rFonts w:ascii="Arial" w:hAnsi="Arial" w:cs="Arial"/>
-          <w:sz w:val="22"/>
-          <w:szCs w:val="22"/>
-        </w:rPr>
-        <w:t xml:space="preserve">                        </w:t>
-      </w:r>
-      <w:proofErr w:type="gramStart"/>
-      <w:r>
-        <w:rPr>
-          <w:rFonts w:ascii="Arial" w:hAnsi="Arial" w:cs="Arial"/>
-          <w:sz w:val="22"/>
-          <w:szCs w:val="22"/>
-        </w:rPr>
+        <w:t>Di ____________</w:t>
         <w:tab/>
         <w:t>)</w:t>
-      </w:r>
-      <w:r>
-        <w:rPr>
-          <w:rFonts w:ascii="Arial" w:hAnsi="Arial" w:cs="Arial"/>
-          <w:sz w:val="22"/>
-          <w:szCs w:val="22"/>
-        </w:rPr>
-        <w:t xml:space="preserve"> </w:t>
-      </w:r>
-      <w:r>
-        <w:rPr>
-          <w:rFonts w:ascii="Arial" w:hAnsi="Arial" w:cs="Arial"/>
-          <w:sz w:val="22"/>
-          <w:szCs w:val="22"/>
-        </w:rPr>
-        <w:t xml:space="preserve">  </w:t>
+        <w:tab/>
+        <w:t>.......................................................</w:t>
+      </w:r>
+      <w:r>
+        <w:rPr>
+          <w:rFonts w:ascii="Arial" w:hAnsi="Arial" w:cs="Arial"/>
+          <w:sz w:val="22"/>
+          <w:szCs w:val="22"/>
+        </w:rPr>
+      </w:r>
+      <w:proofErr w:type="gramStart"/>
+      <w:r>
+        <w:rPr>
+          <w:rFonts w:ascii="Arial" w:hAnsi="Arial" w:cs="Arial"/>
+          <w:sz w:val="22"/>
+          <w:szCs w:val="22"/>
+        </w:rPr>
+      </w:r>
+      <w:r>
+        <w:rPr>
+          <w:rFonts w:ascii="Arial" w:hAnsi="Arial" w:cs="Arial"/>
+          <w:sz w:val="22"/>
+          <w:szCs w:val="22"/>
+        </w:rPr>
+      </w:r>
+      <w:r>
+        <w:rPr>
+          <w:rFonts w:ascii="Arial" w:hAnsi="Arial" w:cs="Arial"/>
+          <w:sz w:val="22"/>
+          <w:szCs w:val="22"/>
+        </w:rPr>
       </w:r>
       <w:proofErr w:type="gramEnd"/>
       <w:r>
@@ -5227,15 +5226,13 @@
           <w:sz w:val="22"/>
           <w:szCs w:val="22"/>
         </w:rPr>
-        <w:t xml:space="preserve">      </w:t>
-      </w:r>
-      <w:r>
-        <w:rPr>
-          <w:rFonts w:ascii="Arial" w:hAnsi="Arial" w:cs="Arial"/>
-          <w:sz w:val="22"/>
-          <w:szCs w:val="22"/>
-        </w:rPr>
-        <w:t>.....................................................</w:t>
+      </w:r>
+      <w:r>
+        <w:rPr>
+          <w:rFonts w:ascii="Arial" w:hAnsi="Arial" w:cs="Arial"/>
+          <w:sz w:val="22"/>
+          <w:szCs w:val="22"/>
+        </w:rPr>
       </w:r>
     </w:p>
     <w:p>
@@ -5256,7 +5253,7 @@
           <w:sz w:val="22"/>
           <w:szCs w:val="22"/>
         </w:rPr>
-        <w:t>Pada</w:t>
+        <w:t>Pada ___________</w:t>
         <w:tab/>
         <w:t>)</w:t>
       </w:r>

</xml_diff>